<commit_message>
feat: update resume DOCX & website tagline to 'Curious enough to build it. Persistent enough to finish it.'
</commit_message>
<xml_diff>
--- a/Pontapalli_Rohith_Resume.docx
+++ b/Pontapalli_Rohith_Resume.docx
@@ -293,61 +293,61 @@
           <w:sz w:val="20"/>
           <w:szCs w:val="20"/>
         </w:rPr>
-        <w:t xml:space="preserve">   |   React, Supabase (PostgreSQL) — contributor</w:t>
-      </w:r>
-    </w:p>
-    <w:p>
-      <w:pPr>
-        <w:pStyle w:val="ListParagraph"/>
-        <w:numPr>
-          <w:ilvl w:val="0"/>
-          <w:numId w:val="1"/>
-        </w:numPr>
-        <w:spacing w:after="20"/>
-      </w:pPr>
-      <w:r>
-        <w:rPr>
-          <w:rFonts w:ascii="Calibri" w:cs="Calibri" w:eastAsia="Calibri" w:hAnsi="Calibri"/>
-          <w:sz w:val="19"/>
-          <w:szCs w:val="19"/>
-        </w:rPr>
-        <w:t xml:space="preserve">Contributed to a full-stack web app for digitizing National Cadet Corps training workflows, including syllabus tracking and mock exams.</w:t>
-      </w:r>
-    </w:p>
-    <w:p>
-      <w:pPr>
-        <w:pStyle w:val="ListParagraph"/>
-        <w:numPr>
-          <w:ilvl w:val="0"/>
-          <w:numId w:val="1"/>
-        </w:numPr>
-        <w:spacing w:after="20"/>
-      </w:pPr>
-      <w:r>
-        <w:rPr>
-          <w:rFonts w:ascii="Calibri" w:cs="Calibri" w:eastAsia="Calibri" w:hAnsi="Calibri"/>
-          <w:sz w:val="19"/>
-          <w:szCs w:val="19"/>
-        </w:rPr>
-        <w:t xml:space="preserve">Worked with Supabase/PostgreSQL to structure application data and applied basic row-level access control concepts.</w:t>
-      </w:r>
-    </w:p>
-    <w:p>
-      <w:pPr>
-        <w:pStyle w:val="ListParagraph"/>
-        <w:numPr>
-          <w:ilvl w:val="0"/>
-          <w:numId w:val="1"/>
-        </w:numPr>
-        <w:spacing w:after="20"/>
-      </w:pPr>
-      <w:r>
-        <w:rPr>
-          <w:rFonts w:ascii="Calibri" w:cs="Calibri" w:eastAsia="Calibri" w:hAnsi="Calibri"/>
-          <w:sz w:val="19"/>
-          <w:szCs w:val="19"/>
-        </w:rPr>
-        <w:t xml:space="preserve">Helped deploy the application live on Vercel; used AI pair programming to learn React fundamentals while building.</w:t>
+        <w:t xml:space="preserve">   |   React, Supabase (PostgreSQL) — solo developer</w:t>
+      </w:r>
+    </w:p>
+    <w:p>
+      <w:pPr>
+        <w:pStyle w:val="ListParagraph"/>
+        <w:numPr>
+          <w:ilvl w:val="0"/>
+          <w:numId w:val="1"/>
+        </w:numPr>
+        <w:spacing w:after="20"/>
+      </w:pPr>
+      <w:r>
+        <w:rPr>
+          <w:rFonts w:ascii="Calibri" w:cs="Calibri" w:eastAsia="Calibri" w:hAnsi="Calibri"/>
+          <w:sz w:val="19"/>
+          <w:szCs w:val="19"/>
+        </w:rPr>
+        <w:t xml:space="preserve">Designed and built a full-stack web app end to end for digitizing National Cadet Corps training workflows, including syllabus tracking and mock exams.</w:t>
+      </w:r>
+    </w:p>
+    <w:p>
+      <w:pPr>
+        <w:pStyle w:val="ListParagraph"/>
+        <w:numPr>
+          <w:ilvl w:val="0"/>
+          <w:numId w:val="1"/>
+        </w:numPr>
+        <w:spacing w:after="20"/>
+      </w:pPr>
+      <w:r>
+        <w:rPr>
+          <w:rFonts w:ascii="Calibri" w:cs="Calibri" w:eastAsia="Calibri" w:hAnsi="Calibri"/>
+          <w:sz w:val="19"/>
+          <w:szCs w:val="19"/>
+        </w:rPr>
+        <w:t xml:space="preserve">Structured the Supabase/PostgreSQL schema and implemented row-level security (RLS) for access control.</w:t>
+      </w:r>
+    </w:p>
+    <w:p>
+      <w:pPr>
+        <w:pStyle w:val="ListParagraph"/>
+        <w:numPr>
+          <w:ilvl w:val="0"/>
+          <w:numId w:val="1"/>
+        </w:numPr>
+        <w:spacing w:after="20"/>
+      </w:pPr>
+      <w:r>
+        <w:rPr>
+          <w:rFonts w:ascii="Calibri" w:cs="Calibri" w:eastAsia="Calibri" w:hAnsi="Calibri"/>
+          <w:sz w:val="19"/>
+          <w:szCs w:val="19"/>
+        </w:rPr>
+        <w:t xml:space="preserve">Built and deployed the application live on Vercel independently, using AI pair programming as an active development workflow throughout.</w:t>
       </w:r>
     </w:p>
     <w:p>
@@ -387,43 +387,43 @@
           <w:sz w:val="20"/>
           <w:szCs w:val="20"/>
         </w:rPr>
-        <w:t xml:space="preserve">   |   Python — Kaggle × Google AI Agents Capstone</w:t>
-      </w:r>
-    </w:p>
-    <w:p>
-      <w:pPr>
-        <w:pStyle w:val="ListParagraph"/>
-        <w:numPr>
-          <w:ilvl w:val="0"/>
-          <w:numId w:val="1"/>
-        </w:numPr>
-        <w:spacing w:after="20"/>
-      </w:pPr>
-      <w:r>
-        <w:rPr>
-          <w:rFonts w:ascii="Calibri" w:cs="Calibri" w:eastAsia="Calibri" w:hAnsi="Calibri"/>
-          <w:sz w:val="19"/>
-          <w:szCs w:val="19"/>
-        </w:rPr>
-        <w:t xml:space="preserve">Explored a multi-step agent pipeline concept in Python aimed at flagging potentially misleading multimodal content.</w:t>
-      </w:r>
-    </w:p>
-    <w:p>
-      <w:pPr>
-        <w:pStyle w:val="ListParagraph"/>
-        <w:numPr>
-          <w:ilvl w:val="0"/>
-          <w:numId w:val="1"/>
-        </w:numPr>
-        <w:spacing w:after="20"/>
-      </w:pPr>
-      <w:r>
-        <w:rPr>
-          <w:rFonts w:ascii="Calibri" w:cs="Calibri" w:eastAsia="Calibri" w:hAnsi="Calibri"/>
-          <w:sz w:val="19"/>
-          <w:szCs w:val="19"/>
-        </w:rPr>
-        <w:t xml:space="preserve">Experimented with the FastMCP protocol to coordinate simple agent-to-agent task handoffs, as an introduction to multi-agent system design.</w:t>
+        <w:t xml:space="preserve">   |   Python — Kaggle × Google 5-Day AI Agents Intensive Capstone</w:t>
+      </w:r>
+    </w:p>
+    <w:p>
+      <w:pPr>
+        <w:pStyle w:val="ListParagraph"/>
+        <w:numPr>
+          <w:ilvl w:val="0"/>
+          <w:numId w:val="1"/>
+        </w:numPr>
+        <w:spacing w:after="20"/>
+      </w:pPr>
+      <w:r>
+        <w:rPr>
+          <w:rFonts w:ascii="Calibri" w:cs="Calibri" w:eastAsia="Calibri" w:hAnsi="Calibri"/>
+          <w:sz w:val="19"/>
+          <w:szCs w:val="19"/>
+        </w:rPr>
+        <w:t xml:space="preserve">Designed and built a multi-agent pipeline in Python to flag potentially misleading multimodal content, submitted as the capstone project for Kaggle × Google's 5-Day AI Agents: Intensive Vibe Coding Course (June 2026).</w:t>
+      </w:r>
+    </w:p>
+    <w:p>
+      <w:pPr>
+        <w:pStyle w:val="ListParagraph"/>
+        <w:numPr>
+          <w:ilvl w:val="0"/>
+          <w:numId w:val="1"/>
+        </w:numPr>
+        <w:spacing w:after="20"/>
+      </w:pPr>
+      <w:r>
+        <w:rPr>
+          <w:rFonts w:ascii="Calibri" w:cs="Calibri" w:eastAsia="Calibri" w:hAnsi="Calibri"/>
+          <w:sz w:val="19"/>
+          <w:szCs w:val="19"/>
+        </w:rPr>
+        <w:t xml:space="preserve">Implemented the FastMCP protocol to coordinate agent-to-agent task handoffs across the pipeline.</w:t>
       </w:r>
     </w:p>
     <w:p>

</xml_diff>